<commit_message>
Actualiza diseno tecnico con integrante
</commit_message>
<xml_diff>
--- a/docs/diseno-tecnico-4-plus-1.docx
+++ b/docs/diseno-tecnico-4-plus-1.docx
@@ -25,7 +25,7 @@
         <w:rPr>
           <w:i/>
         </w:rPr>
-        <w:t>Proyecto en grupo | Arquitectura de software</w:t>
+        <w:t>Proyecto individual | Arquitectura de software</w:t>
       </w:r>
     </w:p>
     <w:tbl>
@@ -195,10 +195,35 @@
           </w:p>
         </w:tc>
       </w:tr>
+      <w:tr>
+        <w:tc>
+          <w:tcPr>
+            <w:tcW w:type="dxa" w:w="4680"/>
+          </w:tcPr>
+          <w:p>
+            <w:r>
+              <w:rPr>
+                <w:b/>
+              </w:rPr>
+              <w:t>Integrante</w:t>
+            </w:r>
+          </w:p>
+        </w:tc>
+        <w:tc>
+          <w:tcPr>
+            <w:tcW w:type="dxa" w:w="4680"/>
+          </w:tcPr>
+          <w:p>
+            <w:r>
+              <w:t>Anfeerny Martinez</w:t>
+            </w:r>
+          </w:p>
+        </w:tc>
+      </w:tr>
     </w:tbl>
     <w:p>
       <w:r>
-        <w:t>Integrantes: completar con los nombres del grupo.</w:t>
+        <w:t>Integrante: Anfeerny Martinez.</w:t>
       </w:r>
     </w:p>
     <w:p>

</xml_diff>

<commit_message>
Limpia caracteres especiales del diseno tecnico
</commit_message>
<xml_diff>
--- a/docs/diseno-tecnico-4-plus-1.docx
+++ b/docs/diseno-tecnico-4-plus-1.docx
@@ -12,9 +12,9 @@
           <w:color w:val="0B2545"/>
           <w:sz w:val="44"/>
         </w:rPr>
-        <w:t>Dise?o t?cnico 4+1</w:t>
+        <w:t>Diseno tecnico 4+1</w:t>
         <w:br/>
-        <w:t>M?quina de Caf? TDD</w:t>
+        <w:t>Maquina de Cafe TDD</w:t>
       </w:r>
     </w:p>
     <w:p>
@@ -32,7 +32,6 @@
       <w:tblPr>
         <w:tblW w:type="auto" w:w="0"/>
         <w:jc w:val="center"/>
-        <w:tblLayout w:type="autofit"/>
         <w:tblLook w:firstColumn="1" w:firstRow="1" w:lastColumn="0" w:lastRow="0" w:noHBand="0" w:noVBand="1" w:val="04A0"/>
       </w:tblPr>
       <w:tblGrid>
@@ -73,7 +72,7 @@
               <w:rPr>
                 <w:b w:val="0"/>
               </w:rPr>
-              <w:t>M?quina de Caf? TDD</w:t>
+              <w:t>Maquina de Cafe TDD</w:t>
             </w:r>
           </w:p>
         </w:tc>
@@ -199,8 +198,14 @@
         <w:tc>
           <w:tcPr>
             <w:tcW w:type="dxa" w:w="4680"/>
+            <w:vAlign w:val="center"/>
+            <w:shd w:fill="F2F4F7"/>
           </w:tcPr>
           <w:p>
+            <w:pPr>
+              <w:spacing w:after="0"/>
+            </w:pPr>
+            <w:r/>
             <w:r>
               <w:rPr>
                 <w:b/>
@@ -212,20 +217,23 @@
         <w:tc>
           <w:tcPr>
             <w:tcW w:type="dxa" w:w="4680"/>
+            <w:vAlign w:val="center"/>
           </w:tcPr>
           <w:p>
+            <w:pPr>
+              <w:spacing w:after="0"/>
+            </w:pPr>
+            <w:r/>
             <w:r>
+              <w:rPr>
+                <w:b w:val="0"/>
+              </w:rPr>
               <w:t>Anfeerny Martinez</w:t>
             </w:r>
           </w:p>
         </w:tc>
       </w:tr>
     </w:tbl>
-    <w:p>
-      <w:r>
-        <w:t>Integrante: Anfeerny Martinez.</w:t>
-      </w:r>
-    </w:p>
     <w:p>
       <w:pPr>
         <w:pStyle w:val="Heading1"/>
@@ -236,7 +244,7 @@
     </w:p>
     <w:p>
       <w:r>
-        <w:t>El sistema implementa una m?quina dispensadora de caf? aplicando la metodolog?a TDD. Permite seleccionar el tama?o del vaso, seleccionar la cantidad de az?car y servir caf?, validando la disponibilidad de vasos, caf? y az?car antes de descontar los insumos.</w:t>
+        <w:t>El sistema implementa una maquina dispensadora de cafe aplicando la metodologia TDD. Permite seleccionar el tamano del vaso, seleccionar la cantidad de azucar y servir cafe, validando la disponibilidad de vasos, cafe y azucar antes de descontar los insumos.</w:t>
       </w:r>
     </w:p>
     <w:p>
@@ -252,7 +260,7 @@
         <w:pStyle w:val="ListBullet"/>
       </w:pPr>
       <w:r>
-        <w:t>Seleccionar vaso peque?o con 3 Oz de caf?.</w:t>
+        <w:t>Seleccionar vaso pequeno con 3 Oz de cafe.</w:t>
       </w:r>
     </w:p>
     <w:p>
@@ -260,7 +268,7 @@
         <w:pStyle w:val="ListBullet"/>
       </w:pPr>
       <w:r>
-        <w:t>Seleccionar vaso mediano con 5 Oz de caf?.</w:t>
+        <w:t>Seleccionar vaso mediano con 5 Oz de cafe.</w:t>
       </w:r>
     </w:p>
     <w:p>
@@ -268,7 +276,7 @@
         <w:pStyle w:val="ListBullet"/>
       </w:pPr>
       <w:r>
-        <w:t>Seleccionar vaso grande con 7 Oz de caf?.</w:t>
+        <w:t>Seleccionar vaso grande con 7 Oz de cafe.</w:t>
       </w:r>
     </w:p>
     <w:p>
@@ -276,7 +284,7 @@
         <w:pStyle w:val="ListBullet"/>
       </w:pPr>
       <w:r>
-        <w:t>Seleccionar la cantidad de cucharadas de az?car.</w:t>
+        <w:t>Seleccionar la cantidad de cucharadas de azucar.</w:t>
       </w:r>
     </w:p>
     <w:p>
@@ -292,7 +300,7 @@
         <w:pStyle w:val="ListBullet"/>
       </w:pPr>
       <w:r>
-        <w:t>Mostrar un mensaje cuando no hay caf? disponible.</w:t>
+        <w:t>Mostrar un mensaje cuando no hay cafe disponible.</w:t>
       </w:r>
     </w:p>
     <w:p>
@@ -300,7 +308,7 @@
         <w:pStyle w:val="ListBullet"/>
       </w:pPr>
       <w:r>
-        <w:t>Mostrar un mensaje cuando no hay az?car disponible.</w:t>
+        <w:t>Mostrar un mensaje cuando no hay azucar disponible.</w:t>
       </w:r>
     </w:p>
     <w:p>
@@ -308,7 +316,7 @@
         <w:pStyle w:val="ListBullet"/>
       </w:pPr>
       <w:r>
-        <w:t>Descontar los insumos solamente cuando el caf? se sirve correctamente.</w:t>
+        <w:t>Descontar los insumos solamente cuando el cafe se sirve correctamente.</w:t>
       </w:r>
     </w:p>
     <w:p>
@@ -321,7 +329,7 @@
     </w:p>
     <w:p>
       <w:r>
-        <w:t>El modelo 4+1 describe la arquitectura del software desde cinco vistas: l?gica, desarrollo, procesos, f?sica y escenarios. Para este proyecto, el modelo se adapta a una aplicaci?n peque?a de dominio orientada a pruebas unitarias.</w:t>
+        <w:t>El modelo 4+1 describe la arquitectura del software desde cinco vistas: logica, desarrollo, procesos, fisica y escenarios. Para este proyecto, el modelo se adapta a una aplicacion pequena de dominio orientada a pruebas unitarias.</w:t>
       </w:r>
     </w:p>
     <w:p>
@@ -329,7 +337,12 @@
         <w:pStyle w:val="Heading1"/>
       </w:pPr>
       <w:r>
-        <w:t>1. Vista l?gica</w:t>
+        <w:t>1. Vista logica</w:t>
+      </w:r>
+    </w:p>
+    <w:p>
+      <w:r>
+        <w:t>La vista logica describe las clases principales del sistema y sus responsabilidades.</w:t>
       </w:r>
     </w:p>
     <w:tbl>
@@ -415,7 +428,7 @@
               <w:rPr>
                 <w:b w:val="0"/>
               </w:rPr>
-              <w:t>Coordina el flujo de servir caf?. Valida existencia de vasos, caf? y az?car.</w:t>
+              <w:t>Coordina el flujo de servir cafe. Valida existencia de vasos, cafe y azucar.</w:t>
             </w:r>
           </w:p>
         </w:tc>
@@ -453,7 +466,7 @@
               <w:rPr>
                 <w:b w:val="0"/>
               </w:rPr>
-              <w:t>Representa un tipo de vaso, su cantidad disponible y las onzas de caf? que requiere.</w:t>
+              <w:t>Representa un tipo de vaso, su cantidad disponible y las onzas de cafe que requiere.</w:t>
             </w:r>
           </w:p>
         </w:tc>
@@ -491,7 +504,7 @@
               <w:rPr>
                 <w:b w:val="0"/>
               </w:rPr>
-              <w:t>Administra la cantidad disponible de caf? en onzas.</w:t>
+              <w:t>Administra la cantidad disponible de cafe en onzas.</w:t>
             </w:r>
           </w:p>
         </w:tc>
@@ -529,7 +542,7 @@
               <w:rPr>
                 <w:b w:val="0"/>
               </w:rPr>
-              <w:t>Administra la cantidad disponible de az?car en cucharadas.</w:t>
+              <w:t>Administra la cantidad disponible de azucar en cucharadas.</w:t>
             </w:r>
           </w:p>
         </w:tc>
@@ -567,7 +580,7 @@
               <w:rPr>
                 <w:b w:val="0"/>
               </w:rPr>
-              <w:t>Validan los criterios de aceptaci?n usando TDD.</w:t>
+              <w:t>Validan los criterios de aceptacion usando TDD.</w:t>
             </w:r>
           </w:p>
         </w:tc>
@@ -575,7 +588,7 @@
     </w:tbl>
     <w:p>
       <w:r>
-        <w:t>Relaciones principales: MaquinaCafe depende de Cafetera, Azucarero y una lista de Vaso. La m?quina consulta disponibilidad antes de descontar insumos, y las pruebas verifican cada regla funcional.</w:t>
+        <w:t>Relaciones principales: MaquinaCafe depende de Cafetera, Azucarero y una lista de Vaso. La maquina consulta disponibilidad antes de descontar insumos, y las pruebas verifican cada regla funcional.</w:t>
       </w:r>
     </w:p>
     <w:p>
@@ -588,14 +601,14 @@
     </w:p>
     <w:p>
       <w:r>
-        <w:t>La vista de desarrollo muestra c?mo est? organizado el c?digo fuente.</w:t>
+        <w:t>La vista de desarrollo muestra como esta organizado el codigo fuente.</w:t>
       </w:r>
     </w:p>
     <w:p>
-      <w:pPr/>
       <w:r>
         <w:rPr>
           <w:rFonts w:ascii="Courier New" w:hAnsi="Courier New"/>
+          <w:sz w:val="20"/>
         </w:rPr>
         <w:t>maquina-cafe-tdd/</w:t>
         <w:br/>
@@ -623,7 +636,7 @@
         <w:pStyle w:val="ListBullet"/>
       </w:pPr>
       <w:r>
-        <w:t>cafe/maquina.py: contiene la l?gica del dominio.</w:t>
+        <w:t>cafe/maquina.py: contiene la logica del dominio.</w:t>
       </w:r>
     </w:p>
     <w:p>
@@ -639,7 +652,7 @@
         <w:pStyle w:val="ListBullet"/>
       </w:pPr>
       <w:r>
-        <w:t>.github/workflows/ci-pipeline.yml: ejecuta el pipeline de integraci?n continua.</w:t>
+        <w:t>.github/workflows/ci-pipeline.yml: ejecuta el pipeline de integracion continua.</w:t>
       </w:r>
     </w:p>
     <w:p>
@@ -647,7 +660,7 @@
         <w:pStyle w:val="ListBullet"/>
       </w:pPr>
       <w:r>
-        <w:t>README.md: documenta el objetivo y c?mo ejecutar las pruebas.</w:t>
+        <w:t>README.md: documenta el objetivo y como ejecutar las pruebas.</w:t>
       </w:r>
     </w:p>
     <w:p>
@@ -655,7 +668,7 @@
         <w:pStyle w:val="ListBullet"/>
       </w:pPr>
       <w:r>
-        <w:t>run_tests.bat: facilita la ejecuci?n de pruebas en Windows.</w:t>
+        <w:t>run_tests.bat: facilita la ejecucion de pruebas en Windows.</w:t>
       </w:r>
     </w:p>
     <w:p>
@@ -667,11 +680,16 @@
       </w:r>
     </w:p>
     <w:p>
+      <w:r>
+        <w:t>La vista de procesos describe el flujo de ejecucion del sistema.</w:t>
+      </w:r>
+    </w:p>
+    <w:p>
       <w:pPr>
         <w:pStyle w:val="Heading2"/>
       </w:pPr>
       <w:r>
-        <w:t>Flujo para servir caf?</w:t>
+        <w:t>Flujo para servir cafe</w:t>
       </w:r>
     </w:p>
     <w:p>
@@ -679,7 +697,7 @@
         <w:pStyle w:val="ListNumber"/>
       </w:pPr>
       <w:r>
-        <w:t>El usuario selecciona el tama?o del vaso.</w:t>
+        <w:t>El usuario selecciona el tamano del vaso.</w:t>
       </w:r>
     </w:p>
     <w:p>
@@ -687,7 +705,7 @@
         <w:pStyle w:val="ListNumber"/>
       </w:pPr>
       <w:r>
-        <w:t>El usuario selecciona la cantidad de az?car.</w:t>
+        <w:t>El usuario selecciona la cantidad de azucar.</w:t>
       </w:r>
     </w:p>
     <w:p>
@@ -695,7 +713,7 @@
         <w:pStyle w:val="ListNumber"/>
       </w:pPr>
       <w:r>
-        <w:t>La m?quina busca el vaso seleccionado.</w:t>
+        <w:t>La maquina busca el vaso seleccionado.</w:t>
       </w:r>
     </w:p>
     <w:p>
@@ -703,7 +721,7 @@
         <w:pStyle w:val="ListNumber"/>
       </w:pPr>
       <w:r>
-        <w:t>La m?quina valida si hay vasos disponibles.</w:t>
+        <w:t>La maquina valida si hay vasos disponibles.</w:t>
       </w:r>
     </w:p>
     <w:p>
@@ -711,7 +729,7 @@
         <w:pStyle w:val="ListNumber"/>
       </w:pPr>
       <w:r>
-        <w:t>La m?quina valida si hay caf? suficiente.</w:t>
+        <w:t>La maquina valida si hay cafe suficiente.</w:t>
       </w:r>
     </w:p>
     <w:p>
@@ -719,7 +737,7 @@
         <w:pStyle w:val="ListNumber"/>
       </w:pPr>
       <w:r>
-        <w:t>La m?quina valida si hay az?car suficiente.</w:t>
+        <w:t>La maquina valida si hay azucar suficiente.</w:t>
       </w:r>
     </w:p>
     <w:p>
@@ -727,7 +745,7 @@
         <w:pStyle w:val="ListNumber"/>
       </w:pPr>
       <w:r>
-        <w:t>Si todas las validaciones son correctas, descuenta vaso, caf? y az?car.</w:t>
+        <w:t>Si todas las validaciones son correctas, descuenta vaso, cafe y azucar.</w:t>
       </w:r>
     </w:p>
     <w:p>
@@ -735,7 +753,7 @@
         <w:pStyle w:val="ListNumber"/>
       </w:pPr>
       <w:r>
-        <w:t>La m?quina retorna el mensaje Cafe servido.</w:t>
+        <w:t>La maquina retorna el mensaje Cafe servido.</w:t>
       </w:r>
     </w:p>
     <w:p>
@@ -743,7 +761,7 @@
         <w:pStyle w:val="ListNumber"/>
       </w:pPr>
       <w:r>
-        <w:t>Si falta alg?n insumo, retorna el mensaje correspondiente sin descontar inventario.</w:t>
+        <w:t>Si falta algun insumo, retorna el mensaje correspondiente sin descontar inventario.</w:t>
       </w:r>
     </w:p>
     <w:p>
@@ -759,7 +777,7 @@
         <w:pStyle w:val="ListNumber"/>
       </w:pPr>
       <w:r>
-        <w:t>Se realiza un push o pull_request en GitHub.</w:t>
+        <w:t>Se realiza un push o un pull_request en GitHub.</w:t>
       </w:r>
     </w:p>
     <w:p>
@@ -807,7 +825,12 @@
         <w:pStyle w:val="Heading1"/>
       </w:pPr>
       <w:r>
-        <w:t>4. Vista f?sica</w:t>
+        <w:t>4. Vista fisica</w:t>
+      </w:r>
+    </w:p>
+    <w:p>
+      <w:r>
+        <w:t>La vista fisica describe donde se ejecuta el sistema.</w:t>
       </w:r>
     </w:p>
     <w:tbl>
@@ -856,7 +879,7 @@
               <w:rPr>
                 <w:b/>
               </w:rPr>
-              <w:t>Tecnolog?a</w:t>
+              <w:t>Tecnologia</w:t>
             </w:r>
           </w:p>
         </w:tc>
@@ -875,7 +898,7 @@
               <w:rPr>
                 <w:b/>
               </w:rPr>
-              <w:t>Descripci?n</w:t>
+              <w:t>Descripcion</w:t>
             </w:r>
           </w:p>
         </w:tc>
@@ -931,7 +954,7 @@
               <w:rPr>
                 <w:b w:val="0"/>
               </w:rPr>
-              <w:t>Ejecuci?n del proyecto y pruebas usando run_tests.bat.</w:t>
+              <w:t>Ejecucion del proyecto y pruebas usando run_tests.bat.</w:t>
             </w:r>
           </w:p>
         </w:tc>
@@ -987,7 +1010,7 @@
               <w:rPr>
                 <w:b w:val="0"/>
               </w:rPr>
-              <w:t>Repositorio p?blico del proyecto.</w:t>
+              <w:t>Repositorio publico del proyecto.</w:t>
             </w:r>
           </w:p>
         </w:tc>
@@ -1043,7 +1066,7 @@
               <w:rPr>
                 <w:b w:val="0"/>
               </w:rPr>
-              <w:t>Ejecuci?n autom?tica de compilaci?n y pruebas.</w:t>
+              <w:t>Ejecucion automatica de compilacion y pruebas.</w:t>
             </w:r>
           </w:p>
         </w:tc>
@@ -1059,68 +1082,85 @@
     </w:p>
     <w:p>
       <w:r>
-        <w:rPr>
-          <w:b/>
-        </w:rPr>
-        <w:t xml:space="preserve">Servir vaso peque?o: </w:t>
+        <w:t>La vista de escenarios conecta la arquitectura con casos de uso reales.</w:t>
       </w:r>
+    </w:p>
+    <w:p>
+      <w:pPr>
+        <w:pStyle w:val="Heading2"/>
+      </w:pPr>
       <w:r>
-        <w:t>Dado que hay vasos peque?os, caf? y az?car disponibles; cuando el consumidor selecciona vaso peque?o; entonces la m?quina sirve 3 Oz de caf? y descuenta los insumos.</w:t>
+        <w:t>Escenario 1: Servir vaso pequeno</w:t>
       </w:r>
     </w:p>
     <w:p>
       <w:r>
-        <w:rPr>
-          <w:b/>
-        </w:rPr>
-        <w:t xml:space="preserve">Servir vaso mediano: </w:t>
+        <w:t>Dado que hay vasos pequenos, cafe y azucar disponibles. Cuando el consumidor selecciona vaso pequeno y una cantidad valida de azucar. Entonces la maquina sirve 3 Oz de cafe y descuenta los insumos.</w:t>
       </w:r>
+    </w:p>
+    <w:p>
+      <w:pPr>
+        <w:pStyle w:val="Heading2"/>
+      </w:pPr>
       <w:r>
-        <w:t>Dado que hay vasos medianos, caf? y az?car disponibles; cuando el consumidor selecciona vaso mediano; entonces la m?quina sirve 5 Oz de caf?.</w:t>
+        <w:t>Escenario 2: Servir vaso mediano</w:t>
       </w:r>
     </w:p>
     <w:p>
       <w:r>
-        <w:rPr>
-          <w:b/>
-        </w:rPr>
-        <w:t xml:space="preserve">Servir vaso grande: </w:t>
+        <w:t>Dado que hay vasos medianos, cafe y azucar disponibles. Cuando el consumidor selecciona vaso mediano. Entonces la maquina sirve 5 Oz de cafe.</w:t>
       </w:r>
+    </w:p>
+    <w:p>
+      <w:pPr>
+        <w:pStyle w:val="Heading2"/>
+      </w:pPr>
       <w:r>
-        <w:t>Dado que hay vasos grandes, caf? y az?car disponibles; cuando el consumidor selecciona vaso grande; entonces la m?quina sirve 7 Oz de caf?.</w:t>
+        <w:t>Escenario 3: Servir vaso grande</w:t>
       </w:r>
     </w:p>
     <w:p>
       <w:r>
-        <w:rPr>
-          <w:b/>
-        </w:rPr>
-        <w:t xml:space="preserve">No hay vasos: </w:t>
+        <w:t>Dado que hay vasos grandes, cafe y azucar disponibles. Cuando el consumidor selecciona vaso grande. Entonces la maquina sirve 7 Oz de cafe.</w:t>
       </w:r>
+    </w:p>
+    <w:p>
+      <w:pPr>
+        <w:pStyle w:val="Heading2"/>
+      </w:pPr>
       <w:r>
-        <w:t>Dado que no hay vasos del tama?o seleccionado; cuando el consumidor intenta servir caf?; entonces la m?quina retorna No hay vasos.</w:t>
+        <w:t>Escenario 4: No hay vasos</w:t>
       </w:r>
     </w:p>
     <w:p>
       <w:r>
-        <w:rPr>
-          <w:b/>
-        </w:rPr>
-        <w:t xml:space="preserve">No hay caf?: </w:t>
+        <w:t>Dado que no hay vasos del tamano seleccionado. Cuando el consumidor intenta servir cafe. Entonces la maquina retorna el mensaje No hay vasos.</w:t>
       </w:r>
+    </w:p>
+    <w:p>
+      <w:pPr>
+        <w:pStyle w:val="Heading2"/>
+      </w:pPr>
       <w:r>
-        <w:t>Dado que la cafetera no tiene caf? suficiente; cuando el consumidor intenta servir caf?; entonces la m?quina retorna No hay cafe.</w:t>
+        <w:t>Escenario 5: No hay cafe</w:t>
       </w:r>
     </w:p>
     <w:p>
       <w:r>
-        <w:rPr>
-          <w:b/>
-        </w:rPr>
-        <w:t xml:space="preserve">No hay az?car: </w:t>
+        <w:t>Dado que la cafetera no tiene cafe suficiente. Cuando el consumidor intenta servir cafe. Entonces la maquina retorna el mensaje No hay cafe.</w:t>
       </w:r>
+    </w:p>
+    <w:p>
+      <w:pPr>
+        <w:pStyle w:val="Heading2"/>
+      </w:pPr>
       <w:r>
-        <w:t>Dado que el azucarero no tiene az?car suficiente; cuando el consumidor intenta servir caf?; entonces la m?quina retorna No hay azucar.</w:t>
+        <w:t>Escenario 6: No hay azucar</w:t>
+      </w:r>
+    </w:p>
+    <w:p>
+      <w:r>
+        <w:t>Dado que el azucarero no tiene azucar suficiente. Cuando el consumidor intenta servir cafe. Entonces la maquina retorna el mensaje No hay azucar.</w:t>
       </w:r>
     </w:p>
     <w:p>
@@ -1128,7 +1168,7 @@
         <w:pStyle w:val="Heading1"/>
       </w:pPr>
       <w:r>
-        <w:t>Decisiones t?cnicas</w:t>
+        <w:t>Decisiones tecnicas</w:t>
       </w:r>
     </w:p>
     <w:p>
@@ -1136,7 +1176,7 @@
         <w:pStyle w:val="ListBullet"/>
       </w:pPr>
       <w:r>
-        <w:t>Se us? Python porque la pr?ctica no exig?a un lenguaje espec?fico.</w:t>
+        <w:t>Se uso Python porque la practica no exigia un lenguaje especifico.</w:t>
       </w:r>
     </w:p>
     <w:p>
@@ -1144,7 +1184,7 @@
         <w:pStyle w:val="ListBullet"/>
       </w:pPr>
       <w:r>
-        <w:t>Se us? unittest porque viene incluido con Python y permite aplicar TDD sin dependencias externas.</w:t>
+        <w:t>Se uso unittest porque viene incluido con Python y permite aplicar TDD sin dependencias externas.</w:t>
       </w:r>
     </w:p>
     <w:p>
@@ -1152,7 +1192,7 @@
         <w:pStyle w:val="ListBullet"/>
       </w:pPr>
       <w:r>
-        <w:t>Se separ? la l?gica del dominio de las pruebas para mantener una estructura simple y clara.</w:t>
+        <w:t>Se separo la logica del dominio de las pruebas para mantener una estructura simple y clara.</w:t>
       </w:r>
     </w:p>
     <w:p>
@@ -1160,7 +1200,7 @@
         <w:pStyle w:val="ListBullet"/>
       </w:pPr>
       <w:r>
-        <w:t>Se configur? GitHub Actions para validar autom?ticamente el proyecto con cada cambio.</w:t>
+        <w:t>Se configuro GitHub Actions para validar automaticamente el proyecto con cada cambio.</w:t>
       </w:r>
     </w:p>
     <w:p>
@@ -1168,12 +1208,12 @@
         <w:pStyle w:val="Heading1"/>
       </w:pPr>
       <w:r>
-        <w:t>Conclusi?n</w:t>
+        <w:t>Conclusion</w:t>
       </w:r>
     </w:p>
     <w:p>
       <w:r>
-        <w:t>La arquitectura propuesta es sencilla y adecuada para el alcance de la pr?ctica. El dise?o separa responsabilidades entre la m?quina, los vasos, la cafetera y el azucarero, y se apoya en pruebas unitarias para garantizar que los criterios de aceptaci?n se cumplen.</w:t>
+        <w:t>La arquitectura propuesta es sencilla y adecuada para el alcance de la practica. El diseno separa responsabilidades entre la maquina, los vasos, la cafetera y el azucarero, y se apoya en pruebas unitarias para garantizar que los criterios de aceptacion se cumplen.</w:t>
       </w:r>
     </w:p>
     <w:sectPr>

</xml_diff>